<commit_message>
Admin: manual deal creation; patch can clear estimate flag
</commit_message>
<xml_diff>
--- a/AfriEnergy-Tracker-Comms-Brief.docx
+++ b/AfriEnergy-Tracker-Comms-Brief.docx
@@ -420,7 +420,7 @@
           <w:sz w:val="22"/>
           <w:szCs w:val="22"/>
         </w:rPr>
-        <w:t xml:space="preserve">AfriEnergy Tracker is an open intelligence platform that aggregates and visualises publicly disclosed energy investment across all 54 African countries. As of August 2026 it tracks 3,259 projects representing US$139.0 billion in disclosed investment, spanning eleven active sectors and more than 1,370 developers and financing entities, with every dollar traceable to a clickable public source.</w:t>
+        <w:t xml:space="preserve">AfriEnergy Tracker is an open intelligence platform that aggregates and visualises publicly disclosed energy investment across all 54 African countries. As of August 2026 it tracks 3,277 projects representing US$141.4 billion in disclosed investment, spanning eleven active sectors and more than 1,370 developers and financing entities, with every dollar traceable to a clickable public source.</w:t>
       </w:r>
     </w:p>
     <w:p>
@@ -708,7 +708,7 @@
                 <w:sz w:val="20"/>
                 <w:szCs w:val="20"/>
               </w:rPr>
-              <w:t xml:space="preserve">US$139.0 billion</w:t>
+              <w:t xml:space="preserve">US$141.4 billion</w:t>
             </w:r>
           </w:p>
         </w:tc>
@@ -766,7 +766,7 @@
                 <w:sz w:val="20"/>
                 <w:szCs w:val="20"/>
               </w:rPr>
-              <w:t xml:space="preserve">3,259</w:t>
+              <w:t xml:space="preserve">3,277</w:t>
             </w:r>
           </w:p>
         </w:tc>
@@ -936,7 +936,7 @@
                 <w:sz w:val="20"/>
                 <w:szCs w:val="20"/>
               </w:rPr>
-              <w:t xml:space="preserve">1,378</w:t>
+              <w:t xml:space="preserve">1,383</w:t>
             </w:r>
           </w:p>
         </w:tc>
@@ -994,7 +994,7 @@
                 <w:sz w:val="20"/>
                 <w:szCs w:val="20"/>
               </w:rPr>
-              <w:t xml:space="preserve">Announced 593 · Financial Close 7 · Construction 610 · Commissioned 1,957</w:t>
+              <w:t xml:space="preserve">Announced 608 · Financial Close 10 · Construction 610 · Commissioned 1,957</w:t>
             </w:r>
           </w:p>
         </w:tc>
@@ -1050,7 +1050,7 @@
                 <w:sz w:val="20"/>
                 <w:szCs w:val="20"/>
               </w:rPr>
-              <w:t xml:space="preserve">1,855 mitigation projects tagged; every record carries a climate-finance class</w:t>
+              <w:t xml:space="preserve">1,871 mitigation projects tagged; every record carries a climate-finance class</w:t>
             </w:r>
           </w:p>
         </w:tc>
@@ -1106,7 +1106,7 @@
           <w:sz w:val="22"/>
           <w:szCs w:val="22"/>
         </w:rPr>
-        <w:t xml:space="preserve">Oil &amp; Gas leads at $65.2B (1,163 projects), followed by Hydro $30.9B (271), Solar $24.3B (1,193), Wind $6.0B (245), Hydrogen $4.6B (25), Geothermal $3.4B (29), Coal $2.6B (234), Grid Expansion $0.9B (7), Battery &amp; Storage $0.6B (4), and Bioenergy $0.5B (78). Solar's profile — the most projects, third-most capital — is itself a story: African solar is many small deals, not a few mega-deals.</w:t>
+        <w:t xml:space="preserve">Oil &amp; Gas leads at $65.2B (1,164 projects), followed by Hydro $32.5B (273), Solar $24.7B (1,204), Wind $6.0B (246), Hydrogen $4.6B (25), Geothermal $3.4B (29), Coal $2.6B (234), Battery &amp; Storage $1.1B (6), Grid Expansion $0.9B (8), and Bioenergy $0.5B (78). Solar's profile — the most projects, third-most capital — is itself a story: African solar is many small deals, not a few mega-deals.</w:t>
       </w:r>
     </w:p>
     <w:p>
@@ -1137,7 +1137,7 @@
           <w:sz w:val="22"/>
           <w:szCs w:val="22"/>
         </w:rPr>
-        <w:t xml:space="preserve">North Africa $32.6B (892 projects) · West Africa $31.4B (698) · Central Africa $27.6B (136) · East Africa $26.4B (339) · Southern Africa $21.1B (1,091). Southern Africa holds the most projects; North Africa the most disclosed capital.</w:t>
+        <w:t xml:space="preserve">North Africa $33.1B (895 projects) · West Africa $31.4B (703) · Central Africa $27.6B (136) · East Africa $26.4B (339) · Southern Africa $22.9B (1,101). Southern Africa holds the most projects; North Africa the most disclosed capital.</w:t>
       </w:r>
     </w:p>
     <w:p>
@@ -1168,7 +1168,7 @@
           <w:sz w:val="22"/>
           <w:szCs w:val="22"/>
         </w:rPr>
-        <w:t xml:space="preserve">Angola $18.2B, Algeria $13.2B, Nigeria $12.4B, Libya $9.9B, Ethiopia $8.5B, South Africa $7.6B (South Africa leads on project count with 500).</w:t>
+        <w:t xml:space="preserve">Angola $18.2B, Algeria $13.2B, Nigeria $12.4B, Libya $9.9B, Ethiopia $8.5B, South Africa $7.7B (South Africa leads on project count with 504).</w:t>
       </w:r>
     </w:p>
     <w:p>
@@ -1645,7 +1645,7 @@
           <w:sz w:val="22"/>
           <w:szCs w:val="22"/>
         </w:rPr>
-        <w:t xml:space="preserve">Behind the interface is an automated collection and verification pipeline: government and multilateral sources and curated news are scraped on the 1st and 15th of each month; a global asset inventory is refreshed monthly; source links are swept daily for link-rot; and a monthly enrichment cycle extracts financing structure (financing types, DFI participation, PPA terms) from primary documents — filling in, never guessing. Machine extraction is followed by validation rules and human review. Roughly 536 tracked projects still await publicly disclosed figures; that number is displayed openly in the platform's data-health reporting and shrinks with every cycle.</w:t>
+        <w:t xml:space="preserve">Behind the interface is an automated collection and verification pipeline: government and multilateral sources and curated news are scraped on the 1st and 15th of each month; a global asset inventory is refreshed monthly; source links are swept daily for link-rot; and a monthly enrichment cycle extracts financing structure (financing types, DFI participation, PPA terms) from primary documents — filling in, never guessing. Machine extraction is followed by validation rules and human review. Roughly 540 tracked projects still await publicly disclosed figures; that number is displayed openly in the platform's data-health reporting and shrinks with every cycle.</w:t>
       </w:r>
     </w:p>
     <w:p>
@@ -3917,7 +3917,7 @@
           <w:sz w:val="22"/>
           <w:szCs w:val="22"/>
         </w:rPr>
-        <w:t xml:space="preserve">3,259 projects, 54 countries, 11 sectors, 1,378 entities — from a continental headline to a single named project in three clicks. Proof points: live dashboard; Deal Tracker filters; per-record source links.</w:t>
+        <w:t xml:space="preserve">3,277 projects, 54 countries, 11 sectors, 1,383 entities — from a continental headline to a single named project in three clicks. Proof points: live dashboard; Deal Tracker filters; per-record source links.</w:t>
       </w:r>
     </w:p>
     <w:p>
@@ -4029,7 +4029,7 @@
           <w:sz w:val="22"/>
           <w:szCs w:val="22"/>
         </w:rPr>
-        <w:t xml:space="preserve">AfriEnergy Tracker is a free, open platform tracking publicly disclosed energy investment — US$139 billion across 3,259 projects in all 54 African countries.</w:t>
+        <w:t xml:space="preserve">AfriEnergy Tracker is a free, open platform tracking publicly disclosed energy investment — US$141 billion across 3,277 projects in all 54 African countries.</w:t>
       </w:r>
     </w:p>
     <w:p>
@@ -4060,7 +4060,7 @@
           <w:sz w:val="22"/>
           <w:szCs w:val="22"/>
         </w:rPr>
-        <w:t xml:space="preserve">AfriEnergy Tracker is an open intelligence platform for African energy investment. It tracks 3,259 projects and US$139 billion in publicly disclosed deals across all 54 countries and eleven sectors, with every figure linked to its source and a published methodology. Built for analysts, investors, journalists, and policymakers.</w:t>
+        <w:t xml:space="preserve">AfriEnergy Tracker is an open intelligence platform for African energy investment. It tracks 3,277 projects and US$141 billion in publicly disclosed deals across all 54 countries and eleven sectors, with every figure linked to its source and a published methodology. Built for analysts, investors, journalists, and policymakers.</w:t>
       </w:r>
     </w:p>
     <w:p>
@@ -4091,7 +4091,7 @@
           <w:sz w:val="22"/>
           <w:szCs w:val="22"/>
         </w:rPr>
-        <w:t xml:space="preserve">AfriEnergy Tracker is an open intelligence platform that aggregates and visualises publicly disclosed energy investment across Africa. It currently tracks 3,259 projects representing US$139 billion in disclosed value across all 54 countries, eleven sectors, and more than 1,370 developers and financing entities. Every headline figure counts only publicly disclosed transaction values — estimates are flagged and excluded, and every record links to its public source under a published methodology. The platform includes a live dashboard, a searchable deal tracker, an AI analyst grounded in the same accounting rules, and a bi-weekly newsletter. Access is free at afrienergytracker.io.</w:t>
+        <w:t xml:space="preserve">AfriEnergy Tracker is an open intelligence platform that aggregates and visualises publicly disclosed energy investment across Africa. It currently tracks 3,277 projects representing US$141 billion in disclosed value across all 54 countries, eleven sectors, and more than 1,370 developers and financing entities. Every headline figure counts only publicly disclosed transaction values — estimates are flagged and excluded, and every record links to its public source under a published methodology. The platform includes a live dashboard, a searchable deal tracker, an AI analyst grounded in the same accounting rules, and a bi-weekly newsletter. Access is free at afrienergytracker.io.</w:t>
       </w:r>
     </w:p>
     <w:p>
@@ -5866,7 +5866,7 @@
           <w:sz w:val="22"/>
           <w:szCs w:val="22"/>
         </w:rPr>
-        <w:t xml:space="preserve">US$139.0 billion in publicly disclosed energy investment tracked across 3,259 projects in all 54 African countries.</w:t>
+        <w:t xml:space="preserve">US$141.4 billion in publicly disclosed energy investment tracked across 3,277 projects in all 54 African countries.</w:t>
       </w:r>
     </w:p>
     <w:p>
@@ -5887,7 +5887,7 @@
           <w:sz w:val="22"/>
           <w:szCs w:val="22"/>
         </w:rPr>
-        <w:t xml:space="preserve">11 sectors: Oil &amp; Gas $65.2B · Hydro $30.9B · Solar $24.3B · Wind $6.0B · Hydrogen $4.6B · Geothermal $3.4B · Coal $2.6B · Grid $0.9B · Storage $0.6B · Bioenergy $0.5B (Nuclear tracked, no disclosed value).</w:t>
+        <w:t xml:space="preserve">11 sectors: Oil &amp; Gas $65.2B · Hydro $32.5B · Solar $24.7B · Wind $6.0B · Hydrogen $4.6B · Geothermal $3.4B · Coal $2.6B · Storage $1.1B · Grid $0.9B · Bioenergy $0.5B (Nuclear tracked, no disclosed value).</w:t>
       </w:r>
     </w:p>
     <w:p>
@@ -5908,7 +5908,7 @@
           <w:sz w:val="22"/>
           <w:szCs w:val="22"/>
         </w:rPr>
-        <w:t xml:space="preserve">Pipeline: 593 announced · 7 at financial close · 610 in construction · 1,957 commissioned.</w:t>
+        <w:t xml:space="preserve">Pipeline: 608 announced · 10 at financial close · 610 in construction · 1,957 commissioned.</w:t>
       </w:r>
     </w:p>
     <w:p>
@@ -5929,7 +5929,7 @@
           <w:sz w:val="22"/>
           <w:szCs w:val="22"/>
         </w:rPr>
-        <w:t xml:space="preserve">Regions by disclosed value: North $32.6B · West $31.4B · Central $27.6B · East $26.4B · Southern $21.1B.</w:t>
+        <w:t xml:space="preserve">Regions by disclosed value: North $33.1B · West $31.4B · Central $27.6B · East $26.4B · Southern $22.9B.</w:t>
       </w:r>
     </w:p>
     <w:p>
@@ -5950,7 +5950,7 @@
           <w:sz w:val="22"/>
           <w:szCs w:val="22"/>
         </w:rPr>
-        <w:t xml:space="preserve">Top countries: Angola $18.2B · Algeria $13.2B · Nigeria $12.4B · Libya $9.9B · Ethiopia $8.5B · South Africa $7.6B.</w:t>
+        <w:t xml:space="preserve">Top countries: Angola $18.2B · Algeria $13.2B · Nigeria $12.4B · Libya $9.9B · Ethiopia $8.5B · South Africa $7.7B.</w:t>
       </w:r>
     </w:p>
     <w:p>
@@ -5971,7 +5971,7 @@
           <w:sz w:val="22"/>
           <w:szCs w:val="22"/>
         </w:rPr>
-        <w:t xml:space="preserve">1,378 developers and financing entities; 1,855 projects classified as climate mitigation.</w:t>
+        <w:t xml:space="preserve">1,383 developers and financing entities; 1,871 projects classified as climate mitigation.</w:t>
       </w:r>
     </w:p>
     <w:p>

</xml_diff>